<commit_message>
Implement OTP functionality with model, utility functions, and constants
</commit_message>
<xml_diff>
--- a/documents/database/LittlePawsDatabase_V1.docx
+++ b/documents/database/LittlePawsDatabase_V1.docx
@@ -6,10 +6,15 @@
       <w:pPr>
         <w:pStyle w:val="Heading1"/>
         <w:jc w:val="center"/>
+        <w:rPr>
+          <w:sz w:val="32"/>
+          <w:szCs w:val="32"/>
+        </w:rPr>
       </w:pPr>
       <w:r>
         <w:rPr>
-          <w:sz w:val="32"/>
+          <w:sz w:val="36"/>
+          <w:szCs w:val="32"/>
         </w:rPr>
         <w:t>Cấu Trúc Dữ Liệu - Little Paws</w:t>
       </w:r>
@@ -771,27 +776,27 @@
           </w:tcPr>
           <w:p>
             <w:r>
-              <w:t>deviceInfo</w:t>
-            </w:r>
-          </w:p>
-        </w:tc>
-        <w:tc>
-          <w:tcPr>
-            <w:tcW w:w="2880" w:type="dxa"/>
-          </w:tcPr>
-          <w:p>
-            <w:r>
-              <w:t>string</w:t>
-            </w:r>
-          </w:p>
-        </w:tc>
-        <w:tc>
-          <w:tcPr>
-            <w:tcW w:w="2880" w:type="dxa"/>
-          </w:tcPr>
-          <w:p>
-            <w:r>
-              <w:t>default: ''</w:t>
+              <w:t>deviceId</w:t>
+            </w:r>
+          </w:p>
+        </w:tc>
+        <w:tc>
+          <w:tcPr>
+            <w:tcW w:w="2880" w:type="dxa"/>
+          </w:tcPr>
+          <w:p>
+            <w:r>
+              <w:t>String</w:t>
+            </w:r>
+          </w:p>
+        </w:tc>
+        <w:tc>
+          <w:tcPr>
+            <w:tcW w:w="2880" w:type="dxa"/>
+          </w:tcPr>
+          <w:p>
+            <w:r>
+              <w:t>required,</w:t>
             </w:r>
           </w:p>
         </w:tc>
@@ -4830,6 +4835,277 @@
           <w:p>
             <w:r>
               <w:t>default: ''</w:t>
+            </w:r>
+          </w:p>
+        </w:tc>
+      </w:tr>
+    </w:tbl>
+    <w:p/>
+    <w:p>
+      <w:pPr>
+        <w:pStyle w:val="Heading2"/>
+      </w:pPr>
+      <w:r>
+        <w:rPr>
+          <w:sz w:val="32"/>
+        </w:rPr>
+        <w:t>Nhóm Hỗ trợ</w:t>
+      </w:r>
+    </w:p>
+    <w:p>
+      <w:pPr>
+        <w:pStyle w:val="Heading3"/>
+        <w:rPr>
+          <w:sz w:val="28"/>
+        </w:rPr>
+      </w:pPr>
+      <w:r>
+        <w:rPr>
+          <w:sz w:val="28"/>
+        </w:rPr>
+        <w:t>16. OTPs</w:t>
+      </w:r>
+    </w:p>
+    <w:tbl>
+      <w:tblPr>
+        <w:tblStyle w:val="TableGrid"/>
+        <w:tblW w:w="0" w:type="auto"/>
+        <w:tblLook w:val="04A0" w:firstRow="1" w:lastRow="0" w:firstColumn="1" w:lastColumn="0" w:noHBand="0" w:noVBand="1"/>
+      </w:tblPr>
+      <w:tblGrid>
+        <w:gridCol w:w="2870"/>
+        <w:gridCol w:w="2868"/>
+        <w:gridCol w:w="3118"/>
+      </w:tblGrid>
+      <w:tr>
+        <w:tc>
+          <w:tcPr>
+            <w:tcW w:w="2870" w:type="dxa"/>
+          </w:tcPr>
+          <w:p>
+            <w:r>
+              <w:rPr>
+                <w:b/>
+              </w:rPr>
+              <w:t>Field</w:t>
+            </w:r>
+          </w:p>
+        </w:tc>
+        <w:tc>
+          <w:tcPr>
+            <w:tcW w:w="2868" w:type="dxa"/>
+          </w:tcPr>
+          <w:p>
+            <w:r>
+              <w:rPr>
+                <w:b/>
+              </w:rPr>
+              <w:t>Type</w:t>
+            </w:r>
+          </w:p>
+        </w:tc>
+        <w:tc>
+          <w:tcPr>
+            <w:tcW w:w="3118" w:type="dxa"/>
+          </w:tcPr>
+          <w:p>
+            <w:r>
+              <w:rPr>
+                <w:b/>
+              </w:rPr>
+              <w:t>Notes</w:t>
+            </w:r>
+          </w:p>
+        </w:tc>
+      </w:tr>
+      <w:tr>
+        <w:tc>
+          <w:tcPr>
+            <w:tcW w:w="2870" w:type="dxa"/>
+          </w:tcPr>
+          <w:p>
+            <w:r>
+              <w:t>_id</w:t>
+            </w:r>
+          </w:p>
+        </w:tc>
+        <w:tc>
+          <w:tcPr>
+            <w:tcW w:w="2868" w:type="dxa"/>
+          </w:tcPr>
+          <w:p>
+            <w:r>
+              <w:t>ObjectId</w:t>
+            </w:r>
+          </w:p>
+        </w:tc>
+        <w:tc>
+          <w:tcPr>
+            <w:tcW w:w="3118" w:type="dxa"/>
+          </w:tcPr>
+          <w:p>
+            <w:r>
+              <w:t>Primary key</w:t>
+            </w:r>
+          </w:p>
+        </w:tc>
+      </w:tr>
+      <w:tr>
+        <w:tc>
+          <w:tcPr>
+            <w:tcW w:w="2870" w:type="dxa"/>
+          </w:tcPr>
+          <w:p>
+            <w:r>
+              <w:t>userId</w:t>
+            </w:r>
+          </w:p>
+        </w:tc>
+        <w:tc>
+          <w:tcPr>
+            <w:tcW w:w="2868" w:type="dxa"/>
+          </w:tcPr>
+          <w:p>
+            <w:r>
+              <w:t>ObjectId</w:t>
+            </w:r>
+          </w:p>
+        </w:tc>
+        <w:tc>
+          <w:tcPr>
+            <w:tcW w:w="3118" w:type="dxa"/>
+          </w:tcPr>
+          <w:p>
+            <w:r>
+              <w:t>ref → Users</w:t>
+            </w:r>
+          </w:p>
+        </w:tc>
+      </w:tr>
+      <w:tr>
+        <w:tc>
+          <w:tcPr>
+            <w:tcW w:w="2870" w:type="dxa"/>
+          </w:tcPr>
+          <w:p>
+            <w:r>
+              <w:t>otpType</w:t>
+            </w:r>
+          </w:p>
+        </w:tc>
+        <w:tc>
+          <w:tcPr>
+            <w:tcW w:w="2868" w:type="dxa"/>
+          </w:tcPr>
+          <w:p>
+            <w:r>
+              <w:t>String</w:t>
+            </w:r>
+          </w:p>
+        </w:tc>
+        <w:tc>
+          <w:tcPr>
+            <w:tcW w:w="3118" w:type="dxa"/>
+          </w:tcPr>
+          <w:p>
+            <w:r>
+              <w:t>enum(VERIFY_ACCOUNT, RESET_PASSWORD, VERIFY_DEVICE, DELETE_ACCOUNT, OWNER_ACCEPT_INVITE)</w:t>
+            </w:r>
+          </w:p>
+        </w:tc>
+      </w:tr>
+      <w:tr>
+        <w:tc>
+          <w:tcPr>
+            <w:tcW w:w="2870" w:type="dxa"/>
+          </w:tcPr>
+          <w:p>
+            <w:r>
+              <w:t>otpCode</w:t>
+            </w:r>
+          </w:p>
+        </w:tc>
+        <w:tc>
+          <w:tcPr>
+            <w:tcW w:w="2868" w:type="dxa"/>
+          </w:tcPr>
+          <w:p>
+            <w:r>
+              <w:t>String</w:t>
+            </w:r>
+          </w:p>
+        </w:tc>
+        <w:tc>
+          <w:tcPr>
+            <w:tcW w:w="3118" w:type="dxa"/>
+          </w:tcPr>
+          <w:p>
+            <w:r>
+              <w:t>Required, hash in code</w:t>
+            </w:r>
+          </w:p>
+        </w:tc>
+      </w:tr>
+      <w:tr>
+        <w:tc>
+          <w:tcPr>
+            <w:tcW w:w="2870" w:type="dxa"/>
+          </w:tcPr>
+          <w:p>
+            <w:r>
+              <w:t>deviceId</w:t>
+            </w:r>
+          </w:p>
+        </w:tc>
+        <w:tc>
+          <w:tcPr>
+            <w:tcW w:w="2868" w:type="dxa"/>
+          </w:tcPr>
+          <w:p>
+            <w:r>
+              <w:t>String</w:t>
+            </w:r>
+          </w:p>
+        </w:tc>
+        <w:tc>
+          <w:tcPr>
+            <w:tcW w:w="3118" w:type="dxa"/>
+          </w:tcPr>
+          <w:p>
+            <w:r>
+              <w:t>Required</w:t>
+            </w:r>
+          </w:p>
+        </w:tc>
+      </w:tr>
+      <w:tr>
+        <w:tc>
+          <w:tcPr>
+            <w:tcW w:w="2870" w:type="dxa"/>
+          </w:tcPr>
+          <w:p>
+            <w:r>
+              <w:t>expiredAt</w:t>
+            </w:r>
+          </w:p>
+        </w:tc>
+        <w:tc>
+          <w:tcPr>
+            <w:tcW w:w="2868" w:type="dxa"/>
+          </w:tcPr>
+          <w:p>
+            <w:r>
+              <w:t>date</w:t>
+            </w:r>
+          </w:p>
+        </w:tc>
+        <w:tc>
+          <w:tcPr>
+            <w:tcW w:w="3118" w:type="dxa"/>
+          </w:tcPr>
+          <w:p>
+            <w:r>
+              <w:t>Required</w:t>
             </w:r>
           </w:p>
         </w:tc>
@@ -5654,6 +5930,7 @@
   <w:style w:type="character" w:default="1" w:styleId="DefaultParagraphFont">
     <w:name w:val="Default Paragraph Font"/>
     <w:uiPriority w:val="1"/>
+    <w:semiHidden/>
     <w:unhideWhenUsed/>
   </w:style>
   <w:style w:type="table" w:default="1" w:styleId="TableNormal">

</xml_diff>

<commit_message>
Refactor authentication and verification modules; implement OTP handling and session management
</commit_message>
<xml_diff>
--- a/documents/database/LittlePawsDatabase_V1.docx
+++ b/documents/database/LittlePawsDatabase_V1.docx
@@ -4863,7 +4863,19 @@
         <w:rPr>
           <w:sz w:val="28"/>
         </w:rPr>
-        <w:t>16. OTPs</w:t>
+        <w:t xml:space="preserve">16. </w:t>
+      </w:r>
+      <w:r>
+        <w:rPr>
+          <w:sz w:val="28"/>
+        </w:rPr>
+        <w:t>Verification</w:t>
+      </w:r>
+      <w:r>
+        <w:rPr>
+          <w:sz w:val="28"/>
+        </w:rPr>
+        <w:t>s</w:t>
       </w:r>
     </w:p>
     <w:tbl>
@@ -4989,7 +5001,7 @@
           </w:tcPr>
           <w:p>
             <w:r>
-              <w:t>otpType</w:t>
+              <w:t>deviceId</w:t>
             </w:r>
           </w:p>
         </w:tc>
@@ -5009,7 +5021,7 @@
           </w:tcPr>
           <w:p>
             <w:r>
-              <w:t>enum(VERIFY_ACCOUNT, RESET_PASSWORD, VERIFY_DEVICE, DELETE_ACCOUNT, OWNER_ACCEPT_INVITE)</w:t>
+              <w:t>Required</w:t>
             </w:r>
           </w:p>
         </w:tc>
@@ -5021,7 +5033,10 @@
           </w:tcPr>
           <w:p>
             <w:r>
-              <w:t>otpCode</w:t>
+              <w:t>verification</w:t>
+            </w:r>
+            <w:r>
+              <w:t>Type</w:t>
             </w:r>
           </w:p>
         </w:tc>
@@ -5041,7 +5056,7 @@
           </w:tcPr>
           <w:p>
             <w:r>
-              <w:t>Required, hash in code</w:t>
+              <w:t>enum(VERIFY_ACCOUNT, RESET_PASSWORD, VERIFY_DEVICE, DELETE_ACCOUNT, OWNER_ACCEPT_INVITE)</w:t>
             </w:r>
           </w:p>
         </w:tc>
@@ -5053,7 +5068,7 @@
           </w:tcPr>
           <w:p>
             <w:r>
-              <w:t>deviceId</w:t>
+              <w:t>otpCode</w:t>
             </w:r>
           </w:p>
         </w:tc>
@@ -5073,7 +5088,39 @@
           </w:tcPr>
           <w:p>
             <w:r>
-              <w:t>Required</w:t>
+              <w:t>Required, hash in code</w:t>
+            </w:r>
+          </w:p>
+        </w:tc>
+      </w:tr>
+      <w:tr>
+        <w:tc>
+          <w:tcPr>
+            <w:tcW w:w="2870" w:type="dxa"/>
+          </w:tcPr>
+          <w:p>
+            <w:r>
+              <w:t>token</w:t>
+            </w:r>
+          </w:p>
+        </w:tc>
+        <w:tc>
+          <w:tcPr>
+            <w:tcW w:w="2868" w:type="dxa"/>
+          </w:tcPr>
+          <w:p>
+            <w:r>
+              <w:t>String</w:t>
+            </w:r>
+          </w:p>
+        </w:tc>
+        <w:tc>
+          <w:tcPr>
+            <w:tcW w:w="3118" w:type="dxa"/>
+          </w:tcPr>
+          <w:p>
+            <w:r>
+              <w:t>Required, hash in code</w:t>
             </w:r>
           </w:p>
         </w:tc>

</xml_diff>

<commit_message>
done pet, pet owner, user for user
</commit_message>
<xml_diff>
--- a/documents/database/LittlePawsDatabase_V1.docx
+++ b/documents/database/LittlePawsDatabase_V1.docx
@@ -312,8 +312,13 @@
             <w:tcW w:w="2880" w:type="dxa"/>
           </w:tcPr>
           <w:p>
-            <w:r>
-              <w:t>default: ''</w:t>
+            <w:proofErr w:type="gramStart"/>
+            <w:r>
+              <w:t>default: '</w:t>
+            </w:r>
+            <w:proofErr w:type="gramEnd"/>
+            <w:r>
+              <w:t>'</w:t>
             </w:r>
           </w:p>
         </w:tc>
@@ -344,8 +349,13 @@
             <w:tcW w:w="2880" w:type="dxa"/>
           </w:tcPr>
           <w:p>
-            <w:r>
-              <w:t>enum(USER, ADMIN) - default: USER</w:t>
+            <w:proofErr w:type="gramStart"/>
+            <w:r>
+              <w:t>enum(</w:t>
+            </w:r>
+            <w:proofErr w:type="gramEnd"/>
+            <w:r>
+              <w:t>USER, ADMIN) - default: USER</w:t>
             </w:r>
           </w:p>
         </w:tc>
@@ -376,8 +386,13 @@
             <w:tcW w:w="2880" w:type="dxa"/>
           </w:tcPr>
           <w:p>
-            <w:r>
-              <w:t>enum(UNACTIVE, ACTIVE, BANNED) - default: UNACTIVE</w:t>
+            <w:proofErr w:type="gramStart"/>
+            <w:r>
+              <w:t>enum(</w:t>
+            </w:r>
+            <w:proofErr w:type="gramEnd"/>
+            <w:r>
+              <w:t>UNACTIVE, ACTIVE, BANNED) - default: UNACTIVE</w:t>
             </w:r>
           </w:p>
         </w:tc>
@@ -569,8 +584,13 @@
             <w:tcW w:w="2880" w:type="dxa"/>
           </w:tcPr>
           <w:p>
-            <w:r>
-              <w:t>enum(google, facebook, apple)</w:t>
+            <w:proofErr w:type="gramStart"/>
+            <w:r>
+              <w:t>enum(</w:t>
+            </w:r>
+            <w:proofErr w:type="gramEnd"/>
+            <w:r>
+              <w:t>google, facebook, apple)</w:t>
             </w:r>
           </w:p>
         </w:tc>
@@ -827,8 +847,13 @@
             <w:tcW w:w="2880" w:type="dxa"/>
           </w:tcPr>
           <w:p>
-            <w:r>
-              <w:t>default: ''</w:t>
+            <w:proofErr w:type="gramStart"/>
+            <w:r>
+              <w:t>default: '</w:t>
+            </w:r>
+            <w:proofErr w:type="gramEnd"/>
+            <w:r>
+              <w:t>'</w:t>
             </w:r>
           </w:p>
         </w:tc>
@@ -859,8 +884,13 @@
             <w:tcW w:w="2880" w:type="dxa"/>
           </w:tcPr>
           <w:p>
-            <w:r>
-              <w:t>default: ''</w:t>
+            <w:proofErr w:type="gramStart"/>
+            <w:r>
+              <w:t>default: '</w:t>
+            </w:r>
+            <w:proofErr w:type="gramEnd"/>
+            <w:r>
+              <w:t>'</w:t>
             </w:r>
           </w:p>
         </w:tc>
@@ -1063,8 +1093,13 @@
             <w:tcW w:w="2880" w:type="dxa"/>
           </w:tcPr>
           <w:p>
-            <w:r>
-              <w:t>default: ''</w:t>
+            <w:proofErr w:type="gramStart"/>
+            <w:r>
+              <w:t>default: '</w:t>
+            </w:r>
+            <w:proofErr w:type="gramEnd"/>
+            <w:r>
+              <w:t>'</w:t>
             </w:r>
           </w:p>
         </w:tc>
@@ -1288,8 +1323,13 @@
             <w:tcW w:w="2880" w:type="dxa"/>
           </w:tcPr>
           <w:p>
-            <w:r>
-              <w:t>default: ''</w:t>
+            <w:proofErr w:type="gramStart"/>
+            <w:r>
+              <w:t>default: '</w:t>
+            </w:r>
+            <w:proofErr w:type="gramEnd"/>
+            <w:r>
+              <w:t>'</w:t>
             </w:r>
           </w:p>
         </w:tc>
@@ -1481,8 +1521,13 @@
             <w:tcW w:w="2880" w:type="dxa"/>
           </w:tcPr>
           <w:p>
-            <w:r>
-              <w:t>default: ''</w:t>
+            <w:proofErr w:type="gramStart"/>
+            <w:r>
+              <w:t>default: '</w:t>
+            </w:r>
+            <w:proofErr w:type="gramEnd"/>
+            <w:r>
+              <w:t>'</w:t>
             </w:r>
           </w:p>
         </w:tc>
@@ -1577,8 +1622,13 @@
             <w:tcW w:w="2880" w:type="dxa"/>
           </w:tcPr>
           <w:p>
-            <w:r>
-              <w:t>enum(male, female, unknown)</w:t>
+            <w:proofErr w:type="gramStart"/>
+            <w:r>
+              <w:t>enum(</w:t>
+            </w:r>
+            <w:proofErr w:type="gramEnd"/>
+            <w:r>
+              <w:t>male, female, unknown)</w:t>
             </w:r>
           </w:p>
         </w:tc>
@@ -1673,8 +1723,13 @@
             <w:tcW w:w="2880" w:type="dxa"/>
           </w:tcPr>
           <w:p>
-            <w:r>
-              <w:t>default: ''</w:t>
+            <w:proofErr w:type="gramStart"/>
+            <w:r>
+              <w:t>default: '</w:t>
+            </w:r>
+            <w:proofErr w:type="gramEnd"/>
+            <w:r>
+              <w:t>'</w:t>
             </w:r>
           </w:p>
         </w:tc>
@@ -1705,8 +1760,13 @@
             <w:tcW w:w="2880" w:type="dxa"/>
           </w:tcPr>
           <w:p>
-            <w:r>
-              <w:t>default: ''</w:t>
+            <w:proofErr w:type="gramStart"/>
+            <w:r>
+              <w:t>default: '</w:t>
+            </w:r>
+            <w:proofErr w:type="gramEnd"/>
+            <w:r>
+              <w:t>'</w:t>
             </w:r>
           </w:p>
         </w:tc>
@@ -1770,8 +1830,13 @@
             <w:tcW w:w="2880" w:type="dxa"/>
           </w:tcPr>
           <w:p>
-            <w:r>
-              <w:t>enum(alive, lost, gone) - default: alive</w:t>
+            <w:proofErr w:type="gramStart"/>
+            <w:r>
+              <w:t>enum(</w:t>
+            </w:r>
+            <w:proofErr w:type="gramEnd"/>
+            <w:r>
+              <w:t>alive, lost, gone) - default: alive</w:t>
             </w:r>
           </w:p>
         </w:tc>
@@ -2011,7 +2076,7 @@
         <w:rPr>
           <w:sz w:val="32"/>
         </w:rPr>
-        <w:t>Nhóm Sức khỏe 1</w:t>
+        <w:t>Nhóm Sức khỏe</w:t>
       </w:r>
     </w:p>
     <w:p>
@@ -2201,38 +2266,6 @@
           <w:p>
             <w:r>
               <w:t>required</w:t>
-            </w:r>
-          </w:p>
-        </w:tc>
-      </w:tr>
-      <w:tr>
-        <w:tc>
-          <w:tcPr>
-            <w:tcW w:w="2880" w:type="dxa"/>
-          </w:tcPr>
-          <w:p>
-            <w:r>
-              <w:t>note</w:t>
-            </w:r>
-          </w:p>
-        </w:tc>
-        <w:tc>
-          <w:tcPr>
-            <w:tcW w:w="2880" w:type="dxa"/>
-          </w:tcPr>
-          <w:p>
-            <w:r>
-              <w:t>string</w:t>
-            </w:r>
-          </w:p>
-        </w:tc>
-        <w:tc>
-          <w:tcPr>
-            <w:tcW w:w="2880" w:type="dxa"/>
-          </w:tcPr>
-          <w:p>
-            <w:r>
-              <w:t>default: ''</w:t>
             </w:r>
           </w:p>
         </w:tc>
@@ -2398,8 +2431,13 @@
             <w:tcW w:w="2880" w:type="dxa"/>
           </w:tcPr>
           <w:p>
-            <w:r>
-              <w:t>enum(vaccine, deworm,</w:t>
+            <w:proofErr w:type="gramStart"/>
+            <w:r>
+              <w:t>enum(</w:t>
+            </w:r>
+            <w:proofErr w:type="gramEnd"/>
+            <w:r>
+              <w:t>vaccine, deworm,</w:t>
             </w:r>
             <w:r>
               <w:t xml:space="preserve"> rabies</w:t>
@@ -2538,8 +2576,13 @@
             <w:tcW w:w="2880" w:type="dxa"/>
           </w:tcPr>
           <w:p>
-            <w:r>
-              <w:t>default: ''</w:t>
+            <w:proofErr w:type="gramStart"/>
+            <w:r>
+              <w:t>default: '</w:t>
+            </w:r>
+            <w:proofErr w:type="gramEnd"/>
+            <w:r>
+              <w:t>'</w:t>
             </w:r>
           </w:p>
         </w:tc>
@@ -2570,8 +2613,13 @@
             <w:tcW w:w="2880" w:type="dxa"/>
           </w:tcPr>
           <w:p>
-            <w:r>
-              <w:t>default: ''</w:t>
+            <w:proofErr w:type="gramStart"/>
+            <w:r>
+              <w:t>default: '</w:t>
+            </w:r>
+            <w:proofErr w:type="gramEnd"/>
+            <w:r>
+              <w:t>'</w:t>
             </w:r>
           </w:p>
         </w:tc>
@@ -2602,8 +2650,13 @@
             <w:tcW w:w="2880" w:type="dxa"/>
           </w:tcPr>
           <w:p>
-            <w:r>
-              <w:t>default: ''</w:t>
+            <w:proofErr w:type="gramStart"/>
+            <w:r>
+              <w:t>default: '</w:t>
+            </w:r>
+            <w:proofErr w:type="gramEnd"/>
+            <w:r>
+              <w:t>'</w:t>
             </w:r>
           </w:p>
         </w:tc>
@@ -2702,7 +2755,6 @@
           </w:tcPr>
           <w:p>
             <w:r>
-              <w:lastRenderedPageBreak/>
               <w:t>_id</w:t>
             </w:r>
           </w:p>
@@ -2735,6 +2787,7 @@
           </w:tcPr>
           <w:p>
             <w:r>
+              <w:lastRenderedPageBreak/>
               <w:t>speciesIds</w:t>
             </w:r>
           </w:p>
@@ -2882,8 +2935,13 @@
             <w:tcW w:w="2880" w:type="dxa"/>
           </w:tcPr>
           <w:p>
-            <w:r>
-              <w:t>enum(dry_food, wet_food, treat, supplement)</w:t>
+            <w:proofErr w:type="gramStart"/>
+            <w:r>
+              <w:t>enum(</w:t>
+            </w:r>
+            <w:proofErr w:type="gramEnd"/>
+            <w:r>
+              <w:t>dry_food, wet_food, treat, supplement)</w:t>
             </w:r>
           </w:p>
         </w:tc>
@@ -2914,8 +2972,13 @@
             <w:tcW w:w="2880" w:type="dxa"/>
           </w:tcPr>
           <w:p>
-            <w:r>
-              <w:t>enum(bottle, pack, piece, box, bag, can)</w:t>
+            <w:proofErr w:type="gramStart"/>
+            <w:r>
+              <w:t>enum(</w:t>
+            </w:r>
+            <w:proofErr w:type="gramEnd"/>
+            <w:r>
+              <w:t>bottle, pack, piece, box, bag, can)</w:t>
             </w:r>
           </w:p>
         </w:tc>
@@ -2978,8 +3041,13 @@
             <w:tcW w:w="2880" w:type="dxa"/>
           </w:tcPr>
           <w:p>
-            <w:r>
-              <w:t>enum(g, kg, ml, L)</w:t>
+            <w:proofErr w:type="gramStart"/>
+            <w:r>
+              <w:t>enum(</w:t>
+            </w:r>
+            <w:proofErr w:type="gramEnd"/>
+            <w:r>
+              <w:t>g, kg, ml, L)</w:t>
             </w:r>
           </w:p>
         </w:tc>
@@ -3010,8 +3078,13 @@
             <w:tcW w:w="2880" w:type="dxa"/>
           </w:tcPr>
           <w:p>
-            <w:r>
-              <w:t>default: ''</w:t>
+            <w:proofErr w:type="gramStart"/>
+            <w:r>
+              <w:t>default: '</w:t>
+            </w:r>
+            <w:proofErr w:type="gramEnd"/>
+            <w:r>
+              <w:t>'</w:t>
             </w:r>
           </w:p>
         </w:tc>
@@ -3311,8 +3384,13 @@
             <w:tcW w:w="2880" w:type="dxa"/>
           </w:tcPr>
           <w:p>
-            <w:r>
-              <w:t>enum(litter, shampoo, cleaning_solution, deodorizer)</w:t>
+            <w:proofErr w:type="gramStart"/>
+            <w:r>
+              <w:t>enum(</w:t>
+            </w:r>
+            <w:proofErr w:type="gramEnd"/>
+            <w:r>
+              <w:t>litter, shampoo, cleaning_solution, deodorizer)</w:t>
             </w:r>
           </w:p>
         </w:tc>
@@ -3343,8 +3421,13 @@
             <w:tcW w:w="2880" w:type="dxa"/>
           </w:tcPr>
           <w:p>
-            <w:r>
-              <w:t>enum(bottle, pack, piece, box, bag, can)</w:t>
+            <w:proofErr w:type="gramStart"/>
+            <w:r>
+              <w:t>enum(</w:t>
+            </w:r>
+            <w:proofErr w:type="gramEnd"/>
+            <w:r>
+              <w:t>bottle, pack, piece, box, bag, can)</w:t>
             </w:r>
           </w:p>
         </w:tc>
@@ -3407,8 +3490,13 @@
             <w:tcW w:w="2880" w:type="dxa"/>
           </w:tcPr>
           <w:p>
-            <w:r>
-              <w:t>enum(g, kg, ml, L)</w:t>
+            <w:proofErr w:type="gramStart"/>
+            <w:r>
+              <w:t>enum(</w:t>
+            </w:r>
+            <w:proofErr w:type="gramEnd"/>
+            <w:r>
+              <w:t>g, kg, ml, L)</w:t>
             </w:r>
           </w:p>
         </w:tc>
@@ -3439,8 +3527,13 @@
             <w:tcW w:w="2880" w:type="dxa"/>
           </w:tcPr>
           <w:p>
-            <w:r>
-              <w:t>default: ''</w:t>
+            <w:proofErr w:type="gramStart"/>
+            <w:r>
+              <w:t>default: '</w:t>
+            </w:r>
+            <w:proofErr w:type="gramEnd"/>
+            <w:r>
+              <w:t>'</w:t>
             </w:r>
           </w:p>
         </w:tc>
@@ -3645,11 +3738,7 @@
           </w:tcPr>
           <w:p>
             <w:r>
-              <w:t xml:space="preserve">ref → Users, default: </w:t>
-            </w:r>
-            <w:r>
-              <w:lastRenderedPageBreak/>
-              <w:t>null (system)</w:t>
+              <w:t>ref → Users, default: null (system)</w:t>
             </w:r>
           </w:p>
         </w:tc>
@@ -3745,8 +3834,13 @@
             <w:tcW w:w="2880" w:type="dxa"/>
           </w:tcPr>
           <w:p>
-            <w:r>
-              <w:t>enum(collar, leash, clothes, toy, bowl, bed)</w:t>
+            <w:proofErr w:type="gramStart"/>
+            <w:r>
+              <w:t>enum(</w:t>
+            </w:r>
+            <w:proofErr w:type="gramEnd"/>
+            <w:r>
+              <w:t>collar, leash, clothes, toy, bowl, bed)</w:t>
             </w:r>
           </w:p>
         </w:tc>
@@ -3777,8 +3871,13 @@
             <w:tcW w:w="2880" w:type="dxa"/>
           </w:tcPr>
           <w:p>
-            <w:r>
-              <w:t>default: ''</w:t>
+            <w:proofErr w:type="gramStart"/>
+            <w:r>
+              <w:t>default: '</w:t>
+            </w:r>
+            <w:proofErr w:type="gramEnd"/>
+            <w:r>
+              <w:t>'</w:t>
             </w:r>
           </w:p>
         </w:tc>
@@ -4058,8 +4157,13 @@
             <w:tcW w:w="2880" w:type="dxa"/>
           </w:tcPr>
           <w:p>
-            <w:r>
-              <w:t>default: ''</w:t>
+            <w:proofErr w:type="gramStart"/>
+            <w:r>
+              <w:t>default: '</w:t>
+            </w:r>
+            <w:proofErr w:type="gramEnd"/>
+            <w:r>
+              <w:t>'</w:t>
             </w:r>
           </w:p>
         </w:tc>
@@ -4469,28 +4573,36 @@
           </w:tcPr>
           <w:p>
             <w:r>
+              <w:t>stockType</w:t>
+            </w:r>
+          </w:p>
+        </w:tc>
+        <w:tc>
+          <w:tcPr>
+            <w:tcW w:w="2880" w:type="dxa"/>
+          </w:tcPr>
+          <w:p>
+            <w:r>
+              <w:t>string</w:t>
+            </w:r>
+          </w:p>
+        </w:tc>
+        <w:tc>
+          <w:tcPr>
+            <w:tcW w:w="2880" w:type="dxa"/>
+          </w:tcPr>
+          <w:p>
+            <w:proofErr w:type="gramStart"/>
+            <w:r>
+              <w:t>enum(</w:t>
+            </w:r>
+            <w:proofErr w:type="gramEnd"/>
+            <w:r>
+              <w:t xml:space="preserve">food, hygiene, </w:t>
+            </w:r>
+            <w:r>
               <w:lastRenderedPageBreak/>
-              <w:t>stockType</w:t>
-            </w:r>
-          </w:p>
-        </w:tc>
-        <w:tc>
-          <w:tcPr>
-            <w:tcW w:w="2880" w:type="dxa"/>
-          </w:tcPr>
-          <w:p>
-            <w:r>
-              <w:t>string</w:t>
-            </w:r>
-          </w:p>
-        </w:tc>
-        <w:tc>
-          <w:tcPr>
-            <w:tcW w:w="2880" w:type="dxa"/>
-          </w:tcPr>
-          <w:p>
-            <w:r>
-              <w:t>enum(food, hygiene, accessory)</w:t>
+              <w:t>accessory)</w:t>
             </w:r>
           </w:p>
         </w:tc>
@@ -4502,6 +4614,7 @@
           </w:tcPr>
           <w:p>
             <w:r>
+              <w:lastRenderedPageBreak/>
               <w:t>quantity</w:t>
             </w:r>
           </w:p>
@@ -4705,8 +4818,13 @@
             <w:tcW w:w="2880" w:type="dxa"/>
           </w:tcPr>
           <w:p>
-            <w:r>
-              <w:t>enum(bath, nail_trim, ear_clean, teeth_clean, grooming)</w:t>
+            <w:proofErr w:type="gramStart"/>
+            <w:r>
+              <w:t>enum(</w:t>
+            </w:r>
+            <w:proofErr w:type="gramEnd"/>
+            <w:r>
+              <w:t>bath, nail_trim, ear_clean, teeth_clean, grooming)</w:t>
             </w:r>
           </w:p>
         </w:tc>
@@ -4833,8 +4951,13 @@
             <w:tcW w:w="2880" w:type="dxa"/>
           </w:tcPr>
           <w:p>
-            <w:r>
-              <w:t>default: ''</w:t>
+            <w:proofErr w:type="gramStart"/>
+            <w:r>
+              <w:t>default: '</w:t>
+            </w:r>
+            <w:proofErr w:type="gramEnd"/>
+            <w:r>
+              <w:t>'</w:t>
             </w:r>
           </w:p>
         </w:tc>
@@ -5001,7 +5124,10 @@
           </w:tcPr>
           <w:p>
             <w:r>
-              <w:t>deviceId</w:t>
+              <w:t>verification</w:t>
+            </w:r>
+            <w:r>
+              <w:t>Type</w:t>
             </w:r>
           </w:p>
         </w:tc>
@@ -5020,43 +5146,13 @@
             <w:tcW w:w="3118" w:type="dxa"/>
           </w:tcPr>
           <w:p>
-            <w:r>
-              <w:t>Required</w:t>
-            </w:r>
-          </w:p>
-        </w:tc>
-      </w:tr>
-      <w:tr>
-        <w:tc>
-          <w:tcPr>
-            <w:tcW w:w="2870" w:type="dxa"/>
-          </w:tcPr>
-          <w:p>
-            <w:r>
-              <w:t>verification</w:t>
-            </w:r>
-            <w:r>
-              <w:t>Type</w:t>
-            </w:r>
-          </w:p>
-        </w:tc>
-        <w:tc>
-          <w:tcPr>
-            <w:tcW w:w="2868" w:type="dxa"/>
-          </w:tcPr>
-          <w:p>
-            <w:r>
-              <w:t>String</w:t>
-            </w:r>
-          </w:p>
-        </w:tc>
-        <w:tc>
-          <w:tcPr>
-            <w:tcW w:w="3118" w:type="dxa"/>
-          </w:tcPr>
-          <w:p>
-            <w:r>
-              <w:t>enum(VERIFY_ACCOUNT, RESET_PASSWORD, VERIFY_DEVICE, DELETE_ACCOUNT, OWNER_ACCEPT_INVITE)</w:t>
+            <w:proofErr w:type="gramStart"/>
+            <w:r>
+              <w:t>enum(</w:t>
+            </w:r>
+            <w:proofErr w:type="gramEnd"/>
+            <w:r>
+              <w:t>VERIFY_ACCOUNT, RESET_PASSWORD, VERIFY_DEVICE, DELETE_ACCOUNT, OWNER_ACCEPT_INVITE)</w:t>
             </w:r>
           </w:p>
         </w:tc>

</xml_diff>